<commit_message>
Ultima Actualizacion TK: #20261381
</commit_message>
<xml_diff>
--- a/src/aportantes/templates/certificado-mora.docx
+++ b/src/aportantes/templates/certificado-mora.docx
@@ -1,6 +1,6 @@
 
 <file path=word/document.xml><?xml version="1.0" encoding="utf-8"?>
-<w:document xmlns:wpc="http://schemas.microsoft.com/office/word/2010/wordprocessingCanvas" xmlns:cx="http://schemas.microsoft.com/office/drawing/2014/chartex" xmlns:cx1="http://schemas.microsoft.com/office/drawing/2015/9/8/chartex" xmlns:cx2="http://schemas.microsoft.com/office/drawing/2015/10/21/chartex" xmlns:cx3="http://schemas.microsoft.com/office/drawing/2016/5/9/chartex" xmlns:cx4="http://schemas.microsoft.com/office/drawing/2016/5/10/chartex" xmlns:cx5="http://schemas.microsoft.com/office/drawing/2016/5/11/chartex" xmlns:cx6="http://schemas.microsoft.com/office/drawing/2016/5/12/chartex" xmlns:cx7="http://schemas.microsoft.com/office/drawing/2016/5/13/chartex" xmlns:cx8="http://schemas.microsoft.com/office/drawing/2016/5/14/chartex" xmlns:mc="http://schemas.openxmlformats.org/markup-compatibility/2006" xmlns:aink="http://schemas.microsoft.com/office/drawing/2016/ink" xmlns:am3d="http://schemas.microsoft.com/office/drawing/2017/model3d" xmlns:o="urn:schemas-microsoft-com:office:office" xmlns:oel="http://schemas.microsoft.com/office/2019/extlst" xmlns:r="http://schemas.openxmlformats.org/officeDocument/2006/relationships" xmlns:m="http://schemas.openxmlformats.org/officeDocument/2006/math" xmlns:v="urn:schemas-microsoft-com:vml" xmlns:wp14="http://schemas.microsoft.com/office/word/2010/wordprocessingDrawing" xmlns:wp="http://schemas.openxmlformats.org/drawingml/2006/wordprocessingDrawing" xmlns:w10="urn:schemas-microsoft-com:office:word" xmlns:w="http://schemas.openxmlformats.org/wordprocessingml/2006/main" xmlns:w14="http://schemas.microsoft.com/office/word/2010/wordml" xmlns:w15="http://schemas.microsoft.com/office/word/2012/wordml" xmlns:w16cex="http://schemas.microsoft.com/office/word/2018/wordml/cex" xmlns:w16cid="http://schemas.microsoft.com/office/word/2016/wordml/cid" xmlns:w16="http://schemas.microsoft.com/office/word/2018/wordml" xmlns:w16du="http://schemas.microsoft.com/office/word/2023/wordml/word16du" xmlns:w16sdtdh="http://schemas.microsoft.com/office/word/2020/wordml/sdtdatahash" xmlns:w16sdtfl="http://schemas.microsoft.com/office/word/2024/wordml/sdtformatlock" xmlns:w16se="http://schemas.microsoft.com/office/word/2015/wordml/symex" xmlns:wpg="http://schemas.microsoft.com/office/word/2010/wordprocessingGroup" xmlns:wpi="http://schemas.microsoft.com/office/word/2010/wordprocessingInk" xmlns:wne="http://schemas.microsoft.com/office/word/2006/wordml" xmlns:wps="http://schemas.microsoft.com/office/word/2010/wordprocessingShape" mc:Ignorable="w14 w15 w16se w16cid w16 w16cex w16sdtdh w16sdtfl w16du wp14">
+<w:document xmlns:wpc="http://schemas.microsoft.com/office/word/2010/wordprocessingCanvas" xmlns:cx="http://schemas.microsoft.com/office/drawing/2014/chartex" xmlns:cx1="http://schemas.microsoft.com/office/drawing/2015/9/8/chartex" xmlns:cx2="http://schemas.microsoft.com/office/drawing/2015/10/21/chartex" xmlns:cx3="http://schemas.microsoft.com/office/drawing/2016/5/9/chartex" xmlns:cx4="http://schemas.microsoft.com/office/drawing/2016/5/10/chartex" xmlns:cx5="http://schemas.microsoft.com/office/drawing/2016/5/11/chartex" xmlns:cx6="http://schemas.microsoft.com/office/drawing/2016/5/12/chartex" xmlns:cx7="http://schemas.microsoft.com/office/drawing/2016/5/13/chartex" xmlns:cx8="http://schemas.microsoft.com/office/drawing/2016/5/14/chartex" xmlns:mc="http://schemas.openxmlformats.org/markup-compatibility/2006" xmlns:aink="http://schemas.microsoft.com/office/drawing/2016/ink" xmlns:am3d="http://schemas.microsoft.com/office/drawing/2017/model3d" xmlns:o="urn:schemas-microsoft-com:office:office" xmlns:r="http://schemas.openxmlformats.org/officeDocument/2006/relationships" xmlns:m="http://schemas.openxmlformats.org/officeDocument/2006/math" xmlns:v="urn:schemas-microsoft-com:vml" xmlns:wp14="http://schemas.microsoft.com/office/word/2010/wordprocessingDrawing" xmlns:wp="http://schemas.openxmlformats.org/drawingml/2006/wordprocessingDrawing" xmlns:w10="urn:schemas-microsoft-com:office:word" xmlns:w="http://schemas.openxmlformats.org/wordprocessingml/2006/main" xmlns:w14="http://schemas.microsoft.com/office/word/2010/wordml" xmlns:w15="http://schemas.microsoft.com/office/word/2012/wordml" xmlns:w16cex="http://schemas.microsoft.com/office/word/2018/wordml/cex" xmlns:w16cid="http://schemas.microsoft.com/office/word/2016/wordml/cid" xmlns:w16="http://schemas.microsoft.com/office/word/2018/wordml" xmlns:w16sdtdh="http://schemas.microsoft.com/office/word/2020/wordml/sdtdatahash" xmlns:w16se="http://schemas.microsoft.com/office/word/2015/wordml/symex" xmlns:wpg="http://schemas.microsoft.com/office/word/2010/wordprocessingGroup" xmlns:wpi="http://schemas.microsoft.com/office/word/2010/wordprocessingInk" xmlns:wne="http://schemas.microsoft.com/office/word/2006/wordml" xmlns:wps="http://schemas.microsoft.com/office/word/2010/wordprocessingShape" mc:Ignorable="w14 w15 w16se w16cid w16 w16cex w16sdtdh wp14">
   <w:body>
     <w:p>
       <w:pPr>
@@ -1629,7 +1629,7 @@
           <w:color w:val="000000"/>
           <w:sz w:val="25"/>
           <w:szCs w:val="25"/>
-          <w:lang w:val="en-US" w:eastAsia="es-MX"/>
+          <w:lang w:eastAsia="es-MX"/>
         </w:rPr>
       </w:pPr>
       <w:r>
@@ -1640,7 +1640,7 @@
           <w:color w:val="000000"/>
           <w:sz w:val="25"/>
           <w:szCs w:val="25"/>
-          <w:lang w:val="en-US" w:eastAsia="es-MX"/>
+          <w:lang w:eastAsia="es-MX"/>
         </w:rPr>
         <w:t>MALLAMAS EPS-</w:t>
       </w:r>
@@ -1652,7 +1652,7 @@
           <w:color w:val="000000"/>
           <w:sz w:val="25"/>
           <w:szCs w:val="25"/>
-          <w:lang w:val="en-US" w:eastAsia="es-MX"/>
+          <w:lang w:eastAsia="es-MX"/>
         </w:rPr>
         <w:t>I</w:t>
       </w:r>
@@ -1666,7 +1666,7 @@
           <w:rFonts w:ascii="Times New Roman" w:eastAsia="Times New Roman" w:hAnsi="Times New Roman" w:cs="Times New Roman"/>
           <w:sz w:val="24"/>
           <w:szCs w:val="24"/>
-          <w:lang w:val="en-US" w:eastAsia="es-MX"/>
+          <w:lang w:eastAsia="es-MX"/>
         </w:rPr>
       </w:pPr>
       <w:r>
@@ -1675,10 +1675,110 @@
           <w:color w:val="000000"/>
           <w:sz w:val="25"/>
           <w:szCs w:val="25"/>
-          <w:lang w:val="en-US" w:eastAsia="es-MX"/>
+          <w:lang w:eastAsia="es-MX"/>
         </w:rPr>
         <w:br/>
       </w:r>
+    </w:p>
+    <w:p>
+      <w:pPr>
+        <w:spacing w:after="0" w:line="240" w:lineRule="auto"/>
+        <w:jc w:val="both"/>
+        <w:rPr>
+          <w:rFonts w:ascii="Arial" w:eastAsia="Times New Roman" w:hAnsi="Arial" w:cs="Arial"/>
+          <w:color w:val="000000"/>
+          <w:sz w:val="16"/>
+          <w:szCs w:val="16"/>
+          <w:lang w:val="es-MX" w:eastAsia="es-MX"/>
+        </w:rPr>
+      </w:pPr>
+      <w:r>
+        <w:rPr>
+          <w:rFonts w:ascii="Arial" w:eastAsia="Times New Roman" w:hAnsi="Arial" w:cs="Arial"/>
+          <w:color w:val="000000"/>
+          <w:sz w:val="16"/>
+          <w:szCs w:val="16"/>
+          <w:lang w:val="es-MX" w:eastAsia="es-MX"/>
+        </w:rPr>
+        <w:t>Nota</w:t>
+      </w:r>
+      <w:r>
+        <w:rPr>
+          <w:rFonts w:ascii="Arial" w:eastAsia="Times New Roman" w:hAnsi="Arial" w:cs="Arial"/>
+          <w:color w:val="000000"/>
+          <w:sz w:val="16"/>
+          <w:szCs w:val="16"/>
+          <w:lang w:val="es-MX" w:eastAsia="es-MX"/>
+        </w:rPr>
+        <w:t xml:space="preserve"> 1</w:t>
+      </w:r>
+      <w:r>
+        <w:rPr>
+          <w:rFonts w:ascii="Arial" w:eastAsia="Times New Roman" w:hAnsi="Arial" w:cs="Arial"/>
+          <w:color w:val="000000"/>
+          <w:sz w:val="16"/>
+          <w:szCs w:val="16"/>
+          <w:lang w:val="es-MX" w:eastAsia="es-MX"/>
+        </w:rPr>
+        <w:t>: El presente certificado fue descargado desde la oficina virtual de aportantes.</w:t>
+      </w:r>
+      <w:r>
+        <w:rPr>
+          <w:rFonts w:ascii="Arial" w:eastAsia="Times New Roman" w:hAnsi="Arial" w:cs="Arial"/>
+          <w:color w:val="000000"/>
+          <w:sz w:val="16"/>
+          <w:szCs w:val="16"/>
+          <w:lang w:val="es-MX" w:eastAsia="es-MX"/>
+        </w:rPr>
+        <w:t xml:space="preserve"> Nota 2:</w:t>
+      </w:r>
+      <w:r>
+        <w:t xml:space="preserve"> </w:t>
+      </w:r>
+      <w:r>
+        <w:rPr>
+          <w:rFonts w:ascii="Arial" w:eastAsia="Times New Roman" w:hAnsi="Arial" w:cs="Arial"/>
+          <w:color w:val="000000"/>
+          <w:sz w:val="16"/>
+          <w:szCs w:val="16"/>
+          <w:lang w:eastAsia="es-MX"/>
+        </w:rPr>
+        <w:t xml:space="preserve">Si el aportante mantiene alguna obligación contractual con uno o más trabajadores y dicha vinculación aún no ha sido reportada a </w:t>
+      </w:r>
+      <w:proofErr w:type="spellStart"/>
+      <w:r>
+        <w:rPr>
+          <w:rFonts w:ascii="Arial" w:eastAsia="Times New Roman" w:hAnsi="Arial" w:cs="Arial"/>
+          <w:color w:val="000000"/>
+          <w:sz w:val="16"/>
+          <w:szCs w:val="16"/>
+          <w:lang w:eastAsia="es-MX"/>
+        </w:rPr>
+        <w:t>Mallamas</w:t>
+      </w:r>
+      <w:proofErr w:type="spellEnd"/>
+      <w:r>
+        <w:rPr>
+          <w:rFonts w:ascii="Arial" w:eastAsia="Times New Roman" w:hAnsi="Arial" w:cs="Arial"/>
+          <w:color w:val="000000"/>
+          <w:sz w:val="16"/>
+          <w:szCs w:val="16"/>
+          <w:lang w:eastAsia="es-MX"/>
+        </w:rPr>
+        <w:t xml:space="preserve"> EPS-I, esta certificación no lo exime del cumplimiento de la obligación de realizar los aportes correspondientes. En consecuencia, los aportes y/o la mora derivados de dicha obligación no se verán reflejados en el presente certificado.</w:t>
+      </w:r>
+    </w:p>
+    <w:p>
+      <w:pPr>
+        <w:spacing w:after="0" w:line="240" w:lineRule="auto"/>
+        <w:jc w:val="both"/>
+        <w:rPr>
+          <w:rFonts w:ascii="Times New Roman" w:eastAsia="Times New Roman" w:hAnsi="Times New Roman" w:cs="Times New Roman"/>
+          <w:sz w:val="24"/>
+          <w:szCs w:val="24"/>
+          <w:lang w:val="es-MX" w:eastAsia="es-MX"/>
+        </w:rPr>
+      </w:pPr>
     </w:p>
     <w:sectPr>
       <w:headerReference w:type="default" r:id="rId6"/>
@@ -1693,7 +1793,7 @@
 </file>
 
 <file path=word/endnotes.xml><?xml version="1.0" encoding="utf-8"?>
-<w:endnotes xmlns:wpc="http://schemas.microsoft.com/office/word/2010/wordprocessingCanvas" xmlns:cx="http://schemas.microsoft.com/office/drawing/2014/chartex" xmlns:cx1="http://schemas.microsoft.com/office/drawing/2015/9/8/chartex" xmlns:cx2="http://schemas.microsoft.com/office/drawing/2015/10/21/chartex" xmlns:cx3="http://schemas.microsoft.com/office/drawing/2016/5/9/chartex" xmlns:cx4="http://schemas.microsoft.com/office/drawing/2016/5/10/chartex" xmlns:cx5="http://schemas.microsoft.com/office/drawing/2016/5/11/chartex" xmlns:cx6="http://schemas.microsoft.com/office/drawing/2016/5/12/chartex" xmlns:cx7="http://schemas.microsoft.com/office/drawing/2016/5/13/chartex" xmlns:cx8="http://schemas.microsoft.com/office/drawing/2016/5/14/chartex" xmlns:mc="http://schemas.openxmlformats.org/markup-compatibility/2006" xmlns:aink="http://schemas.microsoft.com/office/drawing/2016/ink" xmlns:am3d="http://schemas.microsoft.com/office/drawing/2017/model3d" xmlns:o="urn:schemas-microsoft-com:office:office" xmlns:oel="http://schemas.microsoft.com/office/2019/extlst" xmlns:r="http://schemas.openxmlformats.org/officeDocument/2006/relationships" xmlns:m="http://schemas.openxmlformats.org/officeDocument/2006/math" xmlns:v="urn:schemas-microsoft-com:vml" xmlns:wp14="http://schemas.microsoft.com/office/word/2010/wordprocessingDrawing" xmlns:wp="http://schemas.openxmlformats.org/drawingml/2006/wordprocessingDrawing" xmlns:w10="urn:schemas-microsoft-com:office:word" xmlns:w="http://schemas.openxmlformats.org/wordprocessingml/2006/main" xmlns:w14="http://schemas.microsoft.com/office/word/2010/wordml" xmlns:w15="http://schemas.microsoft.com/office/word/2012/wordml" xmlns:w16cex="http://schemas.microsoft.com/office/word/2018/wordml/cex" xmlns:w16cid="http://schemas.microsoft.com/office/word/2016/wordml/cid" xmlns:w16="http://schemas.microsoft.com/office/word/2018/wordml" xmlns:w16du="http://schemas.microsoft.com/office/word/2023/wordml/word16du" xmlns:w16sdtdh="http://schemas.microsoft.com/office/word/2020/wordml/sdtdatahash" xmlns:w16sdtfl="http://schemas.microsoft.com/office/word/2024/wordml/sdtformatlock" xmlns:w16se="http://schemas.microsoft.com/office/word/2015/wordml/symex" xmlns:wpg="http://schemas.microsoft.com/office/word/2010/wordprocessingGroup" xmlns:wpi="http://schemas.microsoft.com/office/word/2010/wordprocessingInk" xmlns:wne="http://schemas.microsoft.com/office/word/2006/wordml" xmlns:wps="http://schemas.microsoft.com/office/word/2010/wordprocessingShape" mc:Ignorable="w14 w15 w16se w16cid w16 w16cex w16sdtdh w16sdtfl w16du wp14">
+<w:endnotes xmlns:wpc="http://schemas.microsoft.com/office/word/2010/wordprocessingCanvas" xmlns:cx="http://schemas.microsoft.com/office/drawing/2014/chartex" xmlns:cx1="http://schemas.microsoft.com/office/drawing/2015/9/8/chartex" xmlns:cx2="http://schemas.microsoft.com/office/drawing/2015/10/21/chartex" xmlns:cx3="http://schemas.microsoft.com/office/drawing/2016/5/9/chartex" xmlns:cx4="http://schemas.microsoft.com/office/drawing/2016/5/10/chartex" xmlns:cx5="http://schemas.microsoft.com/office/drawing/2016/5/11/chartex" xmlns:cx6="http://schemas.microsoft.com/office/drawing/2016/5/12/chartex" xmlns:cx7="http://schemas.microsoft.com/office/drawing/2016/5/13/chartex" xmlns:cx8="http://schemas.microsoft.com/office/drawing/2016/5/14/chartex" xmlns:mc="http://schemas.openxmlformats.org/markup-compatibility/2006" xmlns:aink="http://schemas.microsoft.com/office/drawing/2016/ink" xmlns:am3d="http://schemas.microsoft.com/office/drawing/2017/model3d" xmlns:o="urn:schemas-microsoft-com:office:office" xmlns:r="http://schemas.openxmlformats.org/officeDocument/2006/relationships" xmlns:m="http://schemas.openxmlformats.org/officeDocument/2006/math" xmlns:v="urn:schemas-microsoft-com:vml" xmlns:wp14="http://schemas.microsoft.com/office/word/2010/wordprocessingDrawing" xmlns:wp="http://schemas.openxmlformats.org/drawingml/2006/wordprocessingDrawing" xmlns:w10="urn:schemas-microsoft-com:office:word" xmlns:w="http://schemas.openxmlformats.org/wordprocessingml/2006/main" xmlns:w14="http://schemas.microsoft.com/office/word/2010/wordml" xmlns:w15="http://schemas.microsoft.com/office/word/2012/wordml" xmlns:w16cex="http://schemas.microsoft.com/office/word/2018/wordml/cex" xmlns:w16cid="http://schemas.microsoft.com/office/word/2016/wordml/cid" xmlns:w16="http://schemas.microsoft.com/office/word/2018/wordml" xmlns:w16sdtdh="http://schemas.microsoft.com/office/word/2020/wordml/sdtdatahash" xmlns:w16se="http://schemas.microsoft.com/office/word/2015/wordml/symex" xmlns:wpg="http://schemas.microsoft.com/office/word/2010/wordprocessingGroup" xmlns:wpi="http://schemas.microsoft.com/office/word/2010/wordprocessingInk" xmlns:wne="http://schemas.microsoft.com/office/word/2006/wordml" xmlns:wps="http://schemas.microsoft.com/office/word/2010/wordprocessingShape" mc:Ignorable="w14 w15 w16se w16cid w16 w16cex w16sdtdh wp14">
   <w:endnote w:type="separator" w:id="-1">
     <w:p>
       <w:pPr>
@@ -1718,7 +1818,7 @@
 </file>
 
 <file path=word/footer1.xml><?xml version="1.0" encoding="utf-8"?>
-<w:ftr xmlns:wpc="http://schemas.microsoft.com/office/word/2010/wordprocessingCanvas" xmlns:cx="http://schemas.microsoft.com/office/drawing/2014/chartex" xmlns:cx1="http://schemas.microsoft.com/office/drawing/2015/9/8/chartex" xmlns:cx2="http://schemas.microsoft.com/office/drawing/2015/10/21/chartex" xmlns:cx3="http://schemas.microsoft.com/office/drawing/2016/5/9/chartex" xmlns:cx4="http://schemas.microsoft.com/office/drawing/2016/5/10/chartex" xmlns:cx5="http://schemas.microsoft.com/office/drawing/2016/5/11/chartex" xmlns:cx6="http://schemas.microsoft.com/office/drawing/2016/5/12/chartex" xmlns:cx7="http://schemas.microsoft.com/office/drawing/2016/5/13/chartex" xmlns:cx8="http://schemas.microsoft.com/office/drawing/2016/5/14/chartex" xmlns:mc="http://schemas.openxmlformats.org/markup-compatibility/2006" xmlns:aink="http://schemas.microsoft.com/office/drawing/2016/ink" xmlns:am3d="http://schemas.microsoft.com/office/drawing/2017/model3d" xmlns:o="urn:schemas-microsoft-com:office:office" xmlns:oel="http://schemas.microsoft.com/office/2019/extlst" xmlns:r="http://schemas.openxmlformats.org/officeDocument/2006/relationships" xmlns:m="http://schemas.openxmlformats.org/officeDocument/2006/math" xmlns:v="urn:schemas-microsoft-com:vml" xmlns:wp14="http://schemas.microsoft.com/office/word/2010/wordprocessingDrawing" xmlns:wp="http://schemas.openxmlformats.org/drawingml/2006/wordprocessingDrawing" xmlns:w10="urn:schemas-microsoft-com:office:word" xmlns:w="http://schemas.openxmlformats.org/wordprocessingml/2006/main" xmlns:w14="http://schemas.microsoft.com/office/word/2010/wordml" xmlns:w15="http://schemas.microsoft.com/office/word/2012/wordml" xmlns:w16cex="http://schemas.microsoft.com/office/word/2018/wordml/cex" xmlns:w16cid="http://schemas.microsoft.com/office/word/2016/wordml/cid" xmlns:w16="http://schemas.microsoft.com/office/word/2018/wordml" xmlns:w16du="http://schemas.microsoft.com/office/word/2023/wordml/word16du" xmlns:w16sdtdh="http://schemas.microsoft.com/office/word/2020/wordml/sdtdatahash" xmlns:w16sdtfl="http://schemas.microsoft.com/office/word/2024/wordml/sdtformatlock" xmlns:w16se="http://schemas.microsoft.com/office/word/2015/wordml/symex" xmlns:wpg="http://schemas.microsoft.com/office/word/2010/wordprocessingGroup" xmlns:wpi="http://schemas.microsoft.com/office/word/2010/wordprocessingInk" xmlns:wne="http://schemas.microsoft.com/office/word/2006/wordml" xmlns:wps="http://schemas.microsoft.com/office/word/2010/wordprocessingShape" mc:Ignorable="w14 w15 w16se w16cid w16 w16cex w16sdtdh w16sdtfl w16du wp14">
+<w:ftr xmlns:wpc="http://schemas.microsoft.com/office/word/2010/wordprocessingCanvas" xmlns:cx="http://schemas.microsoft.com/office/drawing/2014/chartex" xmlns:cx1="http://schemas.microsoft.com/office/drawing/2015/9/8/chartex" xmlns:cx2="http://schemas.microsoft.com/office/drawing/2015/10/21/chartex" xmlns:cx3="http://schemas.microsoft.com/office/drawing/2016/5/9/chartex" xmlns:cx4="http://schemas.microsoft.com/office/drawing/2016/5/10/chartex" xmlns:cx5="http://schemas.microsoft.com/office/drawing/2016/5/11/chartex" xmlns:cx6="http://schemas.microsoft.com/office/drawing/2016/5/12/chartex" xmlns:cx7="http://schemas.microsoft.com/office/drawing/2016/5/13/chartex" xmlns:cx8="http://schemas.microsoft.com/office/drawing/2016/5/14/chartex" xmlns:mc="http://schemas.openxmlformats.org/markup-compatibility/2006" xmlns:aink="http://schemas.microsoft.com/office/drawing/2016/ink" xmlns:am3d="http://schemas.microsoft.com/office/drawing/2017/model3d" xmlns:o="urn:schemas-microsoft-com:office:office" xmlns:r="http://schemas.openxmlformats.org/officeDocument/2006/relationships" xmlns:m="http://schemas.openxmlformats.org/officeDocument/2006/math" xmlns:v="urn:schemas-microsoft-com:vml" xmlns:wp14="http://schemas.microsoft.com/office/word/2010/wordprocessingDrawing" xmlns:wp="http://schemas.openxmlformats.org/drawingml/2006/wordprocessingDrawing" xmlns:w10="urn:schemas-microsoft-com:office:word" xmlns:w="http://schemas.openxmlformats.org/wordprocessingml/2006/main" xmlns:w14="http://schemas.microsoft.com/office/word/2010/wordml" xmlns:w15="http://schemas.microsoft.com/office/word/2012/wordml" xmlns:w16cex="http://schemas.microsoft.com/office/word/2018/wordml/cex" xmlns:w16cid="http://schemas.microsoft.com/office/word/2016/wordml/cid" xmlns:w16="http://schemas.microsoft.com/office/word/2018/wordml" xmlns:w16sdtdh="http://schemas.microsoft.com/office/word/2020/wordml/sdtdatahash" xmlns:w16se="http://schemas.microsoft.com/office/word/2015/wordml/symex" xmlns:wpg="http://schemas.microsoft.com/office/word/2010/wordprocessingGroup" xmlns:wpi="http://schemas.microsoft.com/office/word/2010/wordprocessingInk" xmlns:wne="http://schemas.microsoft.com/office/word/2006/wordml" xmlns:wps="http://schemas.microsoft.com/office/word/2010/wordprocessingShape" mc:Ignorable="w14 w15 w16se w16cid w16 w16cex w16sdtdh wp14">
   <w:p>
     <w:pPr>
       <w:pStyle w:val="Piedepgina"/>
@@ -1747,14 +1847,7 @@
         <w:sz w:val="18"/>
         <w:szCs w:val="18"/>
       </w:rPr>
-      <w:t>Nariño) Contactos</w:t>
-    </w:r>
-    <w:r>
-      <w:rPr>
-        <w:sz w:val="18"/>
-        <w:szCs w:val="18"/>
-      </w:rPr>
-      <w:t>: 3175869101 – 3187169485</w:t>
+      <w:t>Nariño) Contactos: 3175869101 – 3187169485</w:t>
     </w:r>
     <w:r>
       <w:rPr>
@@ -1836,7 +1929,7 @@
 </file>
 
 <file path=word/footnotes.xml><?xml version="1.0" encoding="utf-8"?>
-<w:footnotes xmlns:wpc="http://schemas.microsoft.com/office/word/2010/wordprocessingCanvas" xmlns:cx="http://schemas.microsoft.com/office/drawing/2014/chartex" xmlns:cx1="http://schemas.microsoft.com/office/drawing/2015/9/8/chartex" xmlns:cx2="http://schemas.microsoft.com/office/drawing/2015/10/21/chartex" xmlns:cx3="http://schemas.microsoft.com/office/drawing/2016/5/9/chartex" xmlns:cx4="http://schemas.microsoft.com/office/drawing/2016/5/10/chartex" xmlns:cx5="http://schemas.microsoft.com/office/drawing/2016/5/11/chartex" xmlns:cx6="http://schemas.microsoft.com/office/drawing/2016/5/12/chartex" xmlns:cx7="http://schemas.microsoft.com/office/drawing/2016/5/13/chartex" xmlns:cx8="http://schemas.microsoft.com/office/drawing/2016/5/14/chartex" xmlns:mc="http://schemas.openxmlformats.org/markup-compatibility/2006" xmlns:aink="http://schemas.microsoft.com/office/drawing/2016/ink" xmlns:am3d="http://schemas.microsoft.com/office/drawing/2017/model3d" xmlns:o="urn:schemas-microsoft-com:office:office" xmlns:oel="http://schemas.microsoft.com/office/2019/extlst" xmlns:r="http://schemas.openxmlformats.org/officeDocument/2006/relationships" xmlns:m="http://schemas.openxmlformats.org/officeDocument/2006/math" xmlns:v="urn:schemas-microsoft-com:vml" xmlns:wp14="http://schemas.microsoft.com/office/word/2010/wordprocessingDrawing" xmlns:wp="http://schemas.openxmlformats.org/drawingml/2006/wordprocessingDrawing" xmlns:w10="urn:schemas-microsoft-com:office:word" xmlns:w="http://schemas.openxmlformats.org/wordprocessingml/2006/main" xmlns:w14="http://schemas.microsoft.com/office/word/2010/wordml" xmlns:w15="http://schemas.microsoft.com/office/word/2012/wordml" xmlns:w16cex="http://schemas.microsoft.com/office/word/2018/wordml/cex" xmlns:w16cid="http://schemas.microsoft.com/office/word/2016/wordml/cid" xmlns:w16="http://schemas.microsoft.com/office/word/2018/wordml" xmlns:w16du="http://schemas.microsoft.com/office/word/2023/wordml/word16du" xmlns:w16sdtdh="http://schemas.microsoft.com/office/word/2020/wordml/sdtdatahash" xmlns:w16sdtfl="http://schemas.microsoft.com/office/word/2024/wordml/sdtformatlock" xmlns:w16se="http://schemas.microsoft.com/office/word/2015/wordml/symex" xmlns:wpg="http://schemas.microsoft.com/office/word/2010/wordprocessingGroup" xmlns:wpi="http://schemas.microsoft.com/office/word/2010/wordprocessingInk" xmlns:wne="http://schemas.microsoft.com/office/word/2006/wordml" xmlns:wps="http://schemas.microsoft.com/office/word/2010/wordprocessingShape" mc:Ignorable="w14 w15 w16se w16cid w16 w16cex w16sdtdh w16sdtfl w16du wp14">
+<w:footnotes xmlns:wpc="http://schemas.microsoft.com/office/word/2010/wordprocessingCanvas" xmlns:cx="http://schemas.microsoft.com/office/drawing/2014/chartex" xmlns:cx1="http://schemas.microsoft.com/office/drawing/2015/9/8/chartex" xmlns:cx2="http://schemas.microsoft.com/office/drawing/2015/10/21/chartex" xmlns:cx3="http://schemas.microsoft.com/office/drawing/2016/5/9/chartex" xmlns:cx4="http://schemas.microsoft.com/office/drawing/2016/5/10/chartex" xmlns:cx5="http://schemas.microsoft.com/office/drawing/2016/5/11/chartex" xmlns:cx6="http://schemas.microsoft.com/office/drawing/2016/5/12/chartex" xmlns:cx7="http://schemas.microsoft.com/office/drawing/2016/5/13/chartex" xmlns:cx8="http://schemas.microsoft.com/office/drawing/2016/5/14/chartex" xmlns:mc="http://schemas.openxmlformats.org/markup-compatibility/2006" xmlns:aink="http://schemas.microsoft.com/office/drawing/2016/ink" xmlns:am3d="http://schemas.microsoft.com/office/drawing/2017/model3d" xmlns:o="urn:schemas-microsoft-com:office:office" xmlns:r="http://schemas.openxmlformats.org/officeDocument/2006/relationships" xmlns:m="http://schemas.openxmlformats.org/officeDocument/2006/math" xmlns:v="urn:schemas-microsoft-com:vml" xmlns:wp14="http://schemas.microsoft.com/office/word/2010/wordprocessingDrawing" xmlns:wp="http://schemas.openxmlformats.org/drawingml/2006/wordprocessingDrawing" xmlns:w10="urn:schemas-microsoft-com:office:word" xmlns:w="http://schemas.openxmlformats.org/wordprocessingml/2006/main" xmlns:w14="http://schemas.microsoft.com/office/word/2010/wordml" xmlns:w15="http://schemas.microsoft.com/office/word/2012/wordml" xmlns:w16cex="http://schemas.microsoft.com/office/word/2018/wordml/cex" xmlns:w16cid="http://schemas.microsoft.com/office/word/2016/wordml/cid" xmlns:w16="http://schemas.microsoft.com/office/word/2018/wordml" xmlns:w16sdtdh="http://schemas.microsoft.com/office/word/2020/wordml/sdtdatahash" xmlns:w16se="http://schemas.microsoft.com/office/word/2015/wordml/symex" xmlns:wpg="http://schemas.microsoft.com/office/word/2010/wordprocessingGroup" xmlns:wpi="http://schemas.microsoft.com/office/word/2010/wordprocessingInk" xmlns:wne="http://schemas.microsoft.com/office/word/2006/wordml" xmlns:wps="http://schemas.microsoft.com/office/word/2010/wordprocessingShape" mc:Ignorable="w14 w15 w16se w16cid w16 w16cex w16sdtdh wp14">
   <w:footnote w:type="separator" w:id="-1">
     <w:p>
       <w:pPr>
@@ -1861,76 +1954,458 @@
 </file>
 
 <file path=word/header1.xml><?xml version="1.0" encoding="utf-8"?>
-<w:hdr xmlns:wpc="http://schemas.microsoft.com/office/word/2010/wordprocessingCanvas" xmlns:cx="http://schemas.microsoft.com/office/drawing/2014/chartex" xmlns:cx1="http://schemas.microsoft.com/office/drawing/2015/9/8/chartex" xmlns:cx2="http://schemas.microsoft.com/office/drawing/2015/10/21/chartex" xmlns:cx3="http://schemas.microsoft.com/office/drawing/2016/5/9/chartex" xmlns:cx4="http://schemas.microsoft.com/office/drawing/2016/5/10/chartex" xmlns:cx5="http://schemas.microsoft.com/office/drawing/2016/5/11/chartex" xmlns:cx6="http://schemas.microsoft.com/office/drawing/2016/5/12/chartex" xmlns:cx7="http://schemas.microsoft.com/office/drawing/2016/5/13/chartex" xmlns:cx8="http://schemas.microsoft.com/office/drawing/2016/5/14/chartex" xmlns:mc="http://schemas.openxmlformats.org/markup-compatibility/2006" xmlns:aink="http://schemas.microsoft.com/office/drawing/2016/ink" xmlns:am3d="http://schemas.microsoft.com/office/drawing/2017/model3d" xmlns:o="urn:schemas-microsoft-com:office:office" xmlns:oel="http://schemas.microsoft.com/office/2019/extlst" xmlns:r="http://schemas.openxmlformats.org/officeDocument/2006/relationships" xmlns:m="http://schemas.openxmlformats.org/officeDocument/2006/math" xmlns:v="urn:schemas-microsoft-com:vml" xmlns:wp14="http://schemas.microsoft.com/office/word/2010/wordprocessingDrawing" xmlns:wp="http://schemas.openxmlformats.org/drawingml/2006/wordprocessingDrawing" xmlns:w10="urn:schemas-microsoft-com:office:word" xmlns:w="http://schemas.openxmlformats.org/wordprocessingml/2006/main" xmlns:w14="http://schemas.microsoft.com/office/word/2010/wordml" xmlns:w15="http://schemas.microsoft.com/office/word/2012/wordml" xmlns:w16cex="http://schemas.microsoft.com/office/word/2018/wordml/cex" xmlns:w16cid="http://schemas.microsoft.com/office/word/2016/wordml/cid" xmlns:w16="http://schemas.microsoft.com/office/word/2018/wordml" xmlns:w16du="http://schemas.microsoft.com/office/word/2023/wordml/word16du" xmlns:w16sdtdh="http://schemas.microsoft.com/office/word/2020/wordml/sdtdatahash" xmlns:w16sdtfl="http://schemas.microsoft.com/office/word/2024/wordml/sdtformatlock" xmlns:w16se="http://schemas.microsoft.com/office/word/2015/wordml/symex" xmlns:wpg="http://schemas.microsoft.com/office/word/2010/wordprocessingGroup" xmlns:wpi="http://schemas.microsoft.com/office/word/2010/wordprocessingInk" xmlns:wne="http://schemas.microsoft.com/office/word/2006/wordml" xmlns:wps="http://schemas.microsoft.com/office/word/2010/wordprocessingShape" mc:Ignorable="w14 w15 w16se w16cid w16 w16cex w16sdtdh w16sdtfl w16du wp14">
+<w:hdr xmlns:wpc="http://schemas.microsoft.com/office/word/2010/wordprocessingCanvas" xmlns:cx="http://schemas.microsoft.com/office/drawing/2014/chartex" xmlns:cx1="http://schemas.microsoft.com/office/drawing/2015/9/8/chartex" xmlns:cx2="http://schemas.microsoft.com/office/drawing/2015/10/21/chartex" xmlns:cx3="http://schemas.microsoft.com/office/drawing/2016/5/9/chartex" xmlns:cx4="http://schemas.microsoft.com/office/drawing/2016/5/10/chartex" xmlns:cx5="http://schemas.microsoft.com/office/drawing/2016/5/11/chartex" xmlns:cx6="http://schemas.microsoft.com/office/drawing/2016/5/12/chartex" xmlns:cx7="http://schemas.microsoft.com/office/drawing/2016/5/13/chartex" xmlns:cx8="http://schemas.microsoft.com/office/drawing/2016/5/14/chartex" xmlns:mc="http://schemas.openxmlformats.org/markup-compatibility/2006" xmlns:aink="http://schemas.microsoft.com/office/drawing/2016/ink" xmlns:am3d="http://schemas.microsoft.com/office/drawing/2017/model3d" xmlns:o="urn:schemas-microsoft-com:office:office" xmlns:r="http://schemas.openxmlformats.org/officeDocument/2006/relationships" xmlns:m="http://schemas.openxmlformats.org/officeDocument/2006/math" xmlns:v="urn:schemas-microsoft-com:vml" xmlns:wp14="http://schemas.microsoft.com/office/word/2010/wordprocessingDrawing" xmlns:wp="http://schemas.openxmlformats.org/drawingml/2006/wordprocessingDrawing" xmlns:w10="urn:schemas-microsoft-com:office:word" xmlns:w="http://schemas.openxmlformats.org/wordprocessingml/2006/main" xmlns:w14="http://schemas.microsoft.com/office/word/2010/wordml" xmlns:w15="http://schemas.microsoft.com/office/word/2012/wordml" xmlns:w16cex="http://schemas.microsoft.com/office/word/2018/wordml/cex" xmlns:w16cid="http://schemas.microsoft.com/office/word/2016/wordml/cid" xmlns:w16="http://schemas.microsoft.com/office/word/2018/wordml" xmlns:w16sdtdh="http://schemas.microsoft.com/office/word/2020/wordml/sdtdatahash" xmlns:w16se="http://schemas.microsoft.com/office/word/2015/wordml/symex" xmlns:wpg="http://schemas.microsoft.com/office/word/2010/wordprocessingGroup" xmlns:wpi="http://schemas.microsoft.com/office/word/2010/wordprocessingInk" xmlns:wne="http://schemas.microsoft.com/office/word/2006/wordml" xmlns:wps="http://schemas.microsoft.com/office/word/2010/wordprocessingShape" mc:Ignorable="w14 w15 w16se w16cid w16 w16cex w16sdtdh wp14">
+  <w:tbl>
+    <w:tblPr>
+      <w:tblStyle w:val="Tablaconcuadrcula1"/>
+      <w:tblpPr w:leftFromText="141" w:rightFromText="141" w:vertAnchor="text" w:horzAnchor="margin" w:tblpXSpec="center" w:tblpY="165"/>
+      <w:tblW w:w="9832" w:type="dxa"/>
+      <w:tblLook w:val="04A0" w:firstRow="1" w:lastRow="0" w:firstColumn="1" w:lastColumn="0" w:noHBand="0" w:noVBand="1"/>
+    </w:tblPr>
+    <w:tblGrid>
+      <w:gridCol w:w="2337"/>
+      <w:gridCol w:w="4387"/>
+      <w:gridCol w:w="1099"/>
+      <w:gridCol w:w="2009"/>
+    </w:tblGrid>
+    <w:tr>
+      <w:trPr>
+        <w:trHeight w:val="274"/>
+      </w:trPr>
+      <w:tc>
+        <w:tcPr>
+          <w:tcW w:w="2337" w:type="dxa"/>
+          <w:vMerge w:val="restart"/>
+          <w:vAlign w:val="center"/>
+        </w:tcPr>
+        <w:p>
+          <w:pPr>
+            <w:spacing w:line="276" w:lineRule="auto"/>
+            <w:jc w:val="center"/>
+            <w:rPr>
+              <w:noProof/>
+              <w:sz w:val="24"/>
+              <w:szCs w:val="24"/>
+              <w:lang w:eastAsia="es-CO"/>
+            </w:rPr>
+          </w:pPr>
+          <w:r>
+            <w:rPr>
+              <w:rFonts w:ascii="Arial" w:hAnsi="Arial" w:cs="Arial"/>
+              <w:noProof/>
+              <w:sz w:val="24"/>
+              <w:szCs w:val="24"/>
+              <w:lang w:val="es-MX" w:eastAsia="es-MX"/>
+            </w:rPr>
+            <w:drawing>
+              <wp:inline distT="0" distB="0" distL="0" distR="0" wp14:anchorId="59D497A8" wp14:editId="4BCAED1C">
+                <wp:extent cx="1273794" cy="437883"/>
+                <wp:effectExtent l="0" t="0" r="3175" b="635"/>
+                <wp:docPr id="856190500" name="Imagen 856190500" descr="C:\Users\rastreador\Downloads\LOGOS MALLAMAS EPS INDÍGENA.png"/>
+                <wp:cNvGraphicFramePr>
+                  <a:graphicFrameLocks xmlns:a="http://schemas.openxmlformats.org/drawingml/2006/main" noChangeAspect="1"/>
+                </wp:cNvGraphicFramePr>
+                <a:graphic xmlns:a="http://schemas.openxmlformats.org/drawingml/2006/main">
+                  <a:graphicData uri="http://schemas.openxmlformats.org/drawingml/2006/picture">
+                    <pic:pic xmlns:pic="http://schemas.openxmlformats.org/drawingml/2006/picture">
+                      <pic:nvPicPr>
+                        <pic:cNvPr id="0" name="Picture 307" descr="C:\Users\rastreador\Downloads\LOGOS MALLAMAS EPS INDÍGENA.png"/>
+                        <pic:cNvPicPr>
+                          <a:picLocks noChangeAspect="1" noChangeArrowheads="1"/>
+                        </pic:cNvPicPr>
+                      </pic:nvPicPr>
+                      <pic:blipFill>
+                        <a:blip r:embed="rId1" cstate="print">
+                          <a:extLst>
+                            <a:ext uri="{28A0092B-C50C-407E-A947-70E740481C1C}">
+                              <a14:useLocalDpi xmlns:a14="http://schemas.microsoft.com/office/drawing/2010/main" val="0"/>
+                            </a:ext>
+                          </a:extLst>
+                        </a:blip>
+                        <a:srcRect/>
+                        <a:stretch>
+                          <a:fillRect/>
+                        </a:stretch>
+                      </pic:blipFill>
+                      <pic:spPr bwMode="auto">
+                        <a:xfrm>
+                          <a:off x="0" y="0"/>
+                          <a:ext cx="1398601" cy="480787"/>
+                        </a:xfrm>
+                        <a:prstGeom prst="rect">
+                          <a:avLst/>
+                        </a:prstGeom>
+                        <a:noFill/>
+                        <a:ln>
+                          <a:noFill/>
+                        </a:ln>
+                      </pic:spPr>
+                    </pic:pic>
+                  </a:graphicData>
+                </a:graphic>
+              </wp:inline>
+            </w:drawing>
+          </w:r>
+        </w:p>
+      </w:tc>
+      <w:tc>
+        <w:tcPr>
+          <w:tcW w:w="4387" w:type="dxa"/>
+          <w:vMerge w:val="restart"/>
+          <w:vAlign w:val="center"/>
+        </w:tcPr>
+        <w:p>
+          <w:pPr>
+            <w:jc w:val="center"/>
+            <w:rPr>
+              <w:sz w:val="24"/>
+              <w:szCs w:val="24"/>
+            </w:rPr>
+          </w:pPr>
+          <w:r>
+            <w:rPr>
+              <w:sz w:val="24"/>
+              <w:szCs w:val="24"/>
+            </w:rPr>
+            <w:t>CERTIFICADO MORA – OFICINA VIRTUAL</w:t>
+          </w:r>
+        </w:p>
+      </w:tc>
+      <w:tc>
+        <w:tcPr>
+          <w:tcW w:w="1099" w:type="dxa"/>
+          <w:vMerge w:val="restart"/>
+          <w:vAlign w:val="center"/>
+        </w:tcPr>
+        <w:p>
+          <w:pPr>
+            <w:spacing w:line="276" w:lineRule="auto"/>
+            <w:rPr>
+              <w:b/>
+              <w:bCs/>
+              <w:noProof/>
+              <w:sz w:val="20"/>
+              <w:szCs w:val="20"/>
+              <w:lang w:eastAsia="es-CO"/>
+            </w:rPr>
+          </w:pPr>
+          <w:r>
+            <w:rPr>
+              <w:rFonts w:ascii="Arial" w:hAnsi="Arial" w:cs="Arial"/>
+              <w:b/>
+              <w:bCs/>
+              <w:noProof/>
+              <w:sz w:val="24"/>
+              <w:lang w:val="es-MX" w:eastAsia="es-MX"/>
+            </w:rPr>
+            <w:drawing>
+              <wp:inline distT="0" distB="0" distL="0" distR="0" wp14:anchorId="42F72649" wp14:editId="1E849391">
+                <wp:extent cx="560981" cy="490074"/>
+                <wp:effectExtent l="0" t="0" r="0" b="5715"/>
+                <wp:docPr id="814024882" name="Imagen 814024882" descr="C:\Users\rastreador\Downloads\DOCUMENTO CONTROLADO 1.png"/>
+                <wp:cNvGraphicFramePr>
+                  <a:graphicFrameLocks xmlns:a="http://schemas.openxmlformats.org/drawingml/2006/main" noChangeAspect="1"/>
+                </wp:cNvGraphicFramePr>
+                <a:graphic xmlns:a="http://schemas.openxmlformats.org/drawingml/2006/main">
+                  <a:graphicData uri="http://schemas.openxmlformats.org/drawingml/2006/picture">
+                    <pic:pic xmlns:pic="http://schemas.openxmlformats.org/drawingml/2006/picture">
+                      <pic:nvPicPr>
+                        <pic:cNvPr id="0" name="Picture 305" descr="C:\Users\rastreador\Downloads\DOCUMENTO CONTROLADO 1.png"/>
+                        <pic:cNvPicPr>
+                          <a:picLocks noChangeAspect="1" noChangeArrowheads="1"/>
+                        </pic:cNvPicPr>
+                      </pic:nvPicPr>
+                      <pic:blipFill>
+                        <a:blip r:embed="rId2" cstate="print">
+                          <a:extLst>
+                            <a:ext uri="{28A0092B-C50C-407E-A947-70E740481C1C}">
+                              <a14:useLocalDpi xmlns:a14="http://schemas.microsoft.com/office/drawing/2010/main" val="0"/>
+                            </a:ext>
+                          </a:extLst>
+                        </a:blip>
+                        <a:srcRect/>
+                        <a:stretch>
+                          <a:fillRect/>
+                        </a:stretch>
+                      </pic:blipFill>
+                      <pic:spPr bwMode="auto">
+                        <a:xfrm>
+                          <a:off x="0" y="0"/>
+                          <a:ext cx="601196" cy="525206"/>
+                        </a:xfrm>
+                        <a:prstGeom prst="rect">
+                          <a:avLst/>
+                        </a:prstGeom>
+                        <a:noFill/>
+                        <a:ln>
+                          <a:noFill/>
+                        </a:ln>
+                      </pic:spPr>
+                    </pic:pic>
+                  </a:graphicData>
+                </a:graphic>
+              </wp:inline>
+            </w:drawing>
+          </w:r>
+        </w:p>
+      </w:tc>
+      <w:tc>
+        <w:tcPr>
+          <w:tcW w:w="2009" w:type="dxa"/>
+          <w:vAlign w:val="center"/>
+        </w:tcPr>
+        <w:p>
+          <w:pPr>
+            <w:spacing w:line="276" w:lineRule="auto"/>
+            <w:rPr>
+              <w:noProof/>
+              <w:sz w:val="20"/>
+              <w:szCs w:val="20"/>
+              <w:lang w:eastAsia="es-CO"/>
+            </w:rPr>
+          </w:pPr>
+          <w:r>
+            <w:rPr>
+              <w:noProof/>
+              <w:sz w:val="20"/>
+              <w:szCs w:val="20"/>
+              <w:lang w:eastAsia="es-CO"/>
+            </w:rPr>
+            <w:t>Código:</w:t>
+          </w:r>
+          <w:r>
+            <w:rPr>
+              <w:noProof/>
+              <w:sz w:val="20"/>
+              <w:szCs w:val="20"/>
+              <w:lang w:eastAsia="es-CO"/>
+            </w:rPr>
+            <w:t xml:space="preserve"> AS-FR-054</w:t>
+          </w:r>
+        </w:p>
+      </w:tc>
+    </w:tr>
+    <w:tr>
+      <w:trPr>
+        <w:trHeight w:val="295"/>
+      </w:trPr>
+      <w:tc>
+        <w:tcPr>
+          <w:tcW w:w="2337" w:type="dxa"/>
+          <w:vMerge/>
+          <w:vAlign w:val="center"/>
+        </w:tcPr>
+        <w:p>
+          <w:pPr>
+            <w:spacing w:line="276" w:lineRule="auto"/>
+            <w:rPr>
+              <w:noProof/>
+              <w:sz w:val="20"/>
+              <w:szCs w:val="20"/>
+              <w:lang w:eastAsia="es-CO"/>
+            </w:rPr>
+          </w:pPr>
+        </w:p>
+      </w:tc>
+      <w:tc>
+        <w:tcPr>
+          <w:tcW w:w="4387" w:type="dxa"/>
+          <w:vMerge/>
+          <w:vAlign w:val="center"/>
+        </w:tcPr>
+        <w:p>
+          <w:pPr>
+            <w:spacing w:line="276" w:lineRule="auto"/>
+            <w:rPr>
+              <w:noProof/>
+              <w:sz w:val="20"/>
+              <w:szCs w:val="20"/>
+              <w:lang w:eastAsia="es-CO"/>
+            </w:rPr>
+          </w:pPr>
+        </w:p>
+      </w:tc>
+      <w:tc>
+        <w:tcPr>
+          <w:tcW w:w="1099" w:type="dxa"/>
+          <w:vMerge/>
+          <w:vAlign w:val="center"/>
+        </w:tcPr>
+        <w:p>
+          <w:pPr>
+            <w:spacing w:line="276" w:lineRule="auto"/>
+            <w:rPr>
+              <w:noProof/>
+              <w:sz w:val="20"/>
+              <w:szCs w:val="20"/>
+              <w:lang w:eastAsia="es-CO"/>
+            </w:rPr>
+          </w:pPr>
+        </w:p>
+      </w:tc>
+      <w:tc>
+        <w:tcPr>
+          <w:tcW w:w="2009" w:type="dxa"/>
+          <w:vAlign w:val="center"/>
+        </w:tcPr>
+        <w:p>
+          <w:pPr>
+            <w:spacing w:line="276" w:lineRule="auto"/>
+            <w:rPr>
+              <w:noProof/>
+              <w:sz w:val="20"/>
+              <w:szCs w:val="20"/>
+              <w:lang w:eastAsia="es-CO"/>
+            </w:rPr>
+          </w:pPr>
+          <w:r>
+            <w:rPr>
+              <w:noProof/>
+              <w:sz w:val="20"/>
+              <w:szCs w:val="20"/>
+              <w:lang w:eastAsia="es-CO"/>
+            </w:rPr>
+            <w:t xml:space="preserve">Versión: </w:t>
+          </w:r>
+          <w:r>
+            <w:rPr>
+              <w:noProof/>
+              <w:sz w:val="20"/>
+              <w:szCs w:val="20"/>
+              <w:lang w:eastAsia="es-CO"/>
+            </w:rPr>
+            <w:t>01</w:t>
+          </w:r>
+        </w:p>
+      </w:tc>
+    </w:tr>
+    <w:tr>
+      <w:trPr>
+        <w:trHeight w:val="253"/>
+      </w:trPr>
+      <w:tc>
+        <w:tcPr>
+          <w:tcW w:w="2337" w:type="dxa"/>
+          <w:vMerge/>
+          <w:vAlign w:val="center"/>
+        </w:tcPr>
+        <w:p>
+          <w:pPr>
+            <w:spacing w:line="276" w:lineRule="auto"/>
+            <w:rPr>
+              <w:noProof/>
+              <w:sz w:val="20"/>
+              <w:szCs w:val="20"/>
+              <w:lang w:eastAsia="es-CO"/>
+            </w:rPr>
+          </w:pPr>
+        </w:p>
+      </w:tc>
+      <w:tc>
+        <w:tcPr>
+          <w:tcW w:w="4387" w:type="dxa"/>
+          <w:vMerge/>
+          <w:vAlign w:val="center"/>
+        </w:tcPr>
+        <w:p>
+          <w:pPr>
+            <w:spacing w:line="276" w:lineRule="auto"/>
+            <w:rPr>
+              <w:noProof/>
+              <w:sz w:val="20"/>
+              <w:szCs w:val="20"/>
+              <w:lang w:eastAsia="es-CO"/>
+            </w:rPr>
+          </w:pPr>
+        </w:p>
+      </w:tc>
+      <w:tc>
+        <w:tcPr>
+          <w:tcW w:w="1099" w:type="dxa"/>
+          <w:vMerge/>
+          <w:vAlign w:val="center"/>
+        </w:tcPr>
+        <w:p>
+          <w:pPr>
+            <w:spacing w:line="276" w:lineRule="auto"/>
+            <w:rPr>
+              <w:noProof/>
+              <w:sz w:val="20"/>
+              <w:szCs w:val="20"/>
+              <w:lang w:eastAsia="es-CO"/>
+            </w:rPr>
+          </w:pPr>
+        </w:p>
+      </w:tc>
+      <w:tc>
+        <w:tcPr>
+          <w:tcW w:w="2009" w:type="dxa"/>
+          <w:vAlign w:val="center"/>
+        </w:tcPr>
+        <w:p>
+          <w:pPr>
+            <w:spacing w:line="276" w:lineRule="auto"/>
+            <w:ind w:left="708" w:hanging="708"/>
+            <w:rPr>
+              <w:noProof/>
+              <w:sz w:val="20"/>
+              <w:szCs w:val="20"/>
+              <w:lang w:eastAsia="es-CO"/>
+            </w:rPr>
+          </w:pPr>
+          <w:r>
+            <w:rPr>
+              <w:noProof/>
+              <w:sz w:val="20"/>
+              <w:szCs w:val="20"/>
+              <w:lang w:eastAsia="es-CO"/>
+            </w:rPr>
+            <w:t xml:space="preserve">Vigencia: </w:t>
+          </w:r>
+          <w:r>
+            <w:rPr>
+              <w:noProof/>
+              <w:sz w:val="20"/>
+              <w:szCs w:val="20"/>
+              <w:lang w:eastAsia="es-CO"/>
+            </w:rPr>
+            <w:t>05</w:t>
+          </w:r>
+          <w:r>
+            <w:rPr>
+              <w:noProof/>
+              <w:sz w:val="20"/>
+              <w:szCs w:val="20"/>
+              <w:lang w:eastAsia="es-CO"/>
+            </w:rPr>
+            <w:t>/0</w:t>
+          </w:r>
+          <w:r>
+            <w:rPr>
+              <w:noProof/>
+              <w:sz w:val="20"/>
+              <w:szCs w:val="20"/>
+              <w:lang w:eastAsia="es-CO"/>
+            </w:rPr>
+            <w:t>8</w:t>
+          </w:r>
+          <w:r>
+            <w:rPr>
+              <w:noProof/>
+              <w:sz w:val="20"/>
+              <w:szCs w:val="20"/>
+              <w:lang w:eastAsia="es-CO"/>
+            </w:rPr>
+            <w:t>/2026</w:t>
+          </w:r>
+        </w:p>
+      </w:tc>
+    </w:tr>
+  </w:tbl>
   <w:p>
     <w:pPr>
       <w:pStyle w:val="Encabezado"/>
     </w:pPr>
-    <w:r>
-      <w:drawing>
-        <wp:anchor distT="0" distB="0" distL="114300" distR="114300" simplePos="0" relativeHeight="251658752" behindDoc="1" locked="0" layoutInCell="1" allowOverlap="1" wp14:anchorId="6A5124A6" wp14:editId="18523C7A">
-          <wp:simplePos x="0" y="0"/>
-          <wp:positionH relativeFrom="margin">
-            <wp:align>right</wp:align>
-          </wp:positionH>
-          <wp:positionV relativeFrom="paragraph">
-            <wp:posOffset>161925</wp:posOffset>
-          </wp:positionV>
-          <wp:extent cx="5610225" cy="628650"/>
-          <wp:effectExtent l="0" t="0" r="9525" b="0"/>
-          <wp:wrapTight wrapText="bothSides">
-            <wp:wrapPolygon edited="0">
-              <wp:start x="0" y="0"/>
-              <wp:lineTo x="0" y="20945"/>
-              <wp:lineTo x="21563" y="20945"/>
-              <wp:lineTo x="21563" y="0"/>
-              <wp:lineTo x="0" y="0"/>
-            </wp:wrapPolygon>
-          </wp:wrapTight>
-          <wp:docPr id="366831301" name="Imagen 1"/>
-          <wp:cNvGraphicFramePr>
-            <a:graphicFrameLocks xmlns:a="http://schemas.openxmlformats.org/drawingml/2006/main" noChangeAspect="1"/>
-          </wp:cNvGraphicFramePr>
-          <a:graphic xmlns:a="http://schemas.openxmlformats.org/drawingml/2006/main">
-            <a:graphicData uri="http://schemas.openxmlformats.org/drawingml/2006/picture">
-              <pic:pic xmlns:pic="http://schemas.openxmlformats.org/drawingml/2006/picture">
-                <pic:nvPicPr>
-                  <pic:cNvPr id="366831301" name=""/>
-                  <pic:cNvPicPr/>
-                </pic:nvPicPr>
-                <pic:blipFill>
-                  <a:blip r:embed="rId1">
-                    <a:extLst>
-                      <a:ext uri="{28A0092B-C50C-407E-A947-70E740481C1C}">
-                        <a14:useLocalDpi xmlns:a14="http://schemas.microsoft.com/office/drawing/2010/main" val="0"/>
-                      </a:ext>
-                    </a:extLst>
-                  </a:blip>
-                  <a:stretch>
-                    <a:fillRect/>
-                  </a:stretch>
-                </pic:blipFill>
-                <pic:spPr>
-                  <a:xfrm>
-                    <a:off x="0" y="0"/>
-                    <a:ext cx="5610225" cy="628650"/>
-                  </a:xfrm>
-                  <a:prstGeom prst="rect">
-                    <a:avLst/>
-                  </a:prstGeom>
-                </pic:spPr>
-              </pic:pic>
-            </a:graphicData>
-          </a:graphic>
-          <wp14:sizeRelH relativeFrom="margin">
-            <wp14:pctWidth>0</wp14:pctWidth>
-          </wp14:sizeRelH>
-          <wp14:sizeRelV relativeFrom="margin">
-            <wp14:pctHeight>0</wp14:pctHeight>
-          </wp14:sizeRelV>
-        </wp:anchor>
-      </w:drawing>
-    </w:r>
     <w:r>
       <w:rPr>
         <w:noProof/>
@@ -1938,7 +2413,7 @@
         <w:szCs w:val="18"/>
       </w:rPr>
       <w:drawing>
-        <wp:anchor distT="0" distB="0" distL="114300" distR="114300" simplePos="0" relativeHeight="251657728" behindDoc="1" locked="0" layoutInCell="1" allowOverlap="1" wp14:anchorId="79353DE7" wp14:editId="637E204D">
+        <wp:anchor distT="0" distB="0" distL="114300" distR="114300" simplePos="0" relativeHeight="251657728" behindDoc="1" locked="0" layoutInCell="1" allowOverlap="1" wp14:anchorId="79353DE7" wp14:editId="6CE3153C">
           <wp:simplePos x="0" y="0"/>
           <wp:positionH relativeFrom="page">
             <wp:align>left</wp:align>
@@ -1961,7 +2436,7 @@
                   <pic:cNvPicPr/>
                 </pic:nvPicPr>
                 <pic:blipFill>
-                  <a:blip r:embed="rId2">
+                  <a:blip r:embed="rId3">
                     <a:extLst>
                       <a:ext uri="{28A0092B-C50C-407E-A947-70E740481C1C}">
                         <a14:useLocalDpi xmlns:a14="http://schemas.microsoft.com/office/drawing/2010/main" val="0"/>
@@ -2004,7 +2479,7 @@
 </file>
 
 <file path=word/styles.xml><?xml version="1.0" encoding="utf-8"?>
-<w:styles xmlns:mc="http://schemas.openxmlformats.org/markup-compatibility/2006" xmlns:r="http://schemas.openxmlformats.org/officeDocument/2006/relationships" xmlns:w="http://schemas.openxmlformats.org/wordprocessingml/2006/main" xmlns:w14="http://schemas.microsoft.com/office/word/2010/wordml" xmlns:w15="http://schemas.microsoft.com/office/word/2012/wordml" xmlns:w16cex="http://schemas.microsoft.com/office/word/2018/wordml/cex" xmlns:w16cid="http://schemas.microsoft.com/office/word/2016/wordml/cid" xmlns:w16="http://schemas.microsoft.com/office/word/2018/wordml" xmlns:w16du="http://schemas.microsoft.com/office/word/2023/wordml/word16du" xmlns:w16sdtdh="http://schemas.microsoft.com/office/word/2020/wordml/sdtdatahash" xmlns:w16sdtfl="http://schemas.microsoft.com/office/word/2024/wordml/sdtformatlock" xmlns:w16se="http://schemas.microsoft.com/office/word/2015/wordml/symex" mc:Ignorable="w14 w15 w16se w16cid w16 w16cex w16sdtdh w16sdtfl w16du">
+<w:styles xmlns:mc="http://schemas.openxmlformats.org/markup-compatibility/2006" xmlns:r="http://schemas.openxmlformats.org/officeDocument/2006/relationships" xmlns:w="http://schemas.openxmlformats.org/wordprocessingml/2006/main" xmlns:w14="http://schemas.microsoft.com/office/word/2010/wordml" xmlns:w15="http://schemas.microsoft.com/office/word/2012/wordml" xmlns:w16cex="http://schemas.microsoft.com/office/word/2018/wordml/cex" xmlns:w16cid="http://schemas.microsoft.com/office/word/2016/wordml/cid" xmlns:w16="http://schemas.microsoft.com/office/word/2018/wordml" xmlns:w16sdtdh="http://schemas.microsoft.com/office/word/2020/wordml/sdtdatahash" xmlns:w16se="http://schemas.microsoft.com/office/word/2015/wordml/symex" mc:Ignorable="w14 w15 w16se w16cid w16 w16cex w16sdtdh">
   <w:docDefaults>
     <w:rPrDefault>
       <w:rPr>
@@ -2549,6 +3024,26 @@
       <w:szCs w:val="22"/>
     </w:rPr>
   </w:style>
+  <w:style w:type="table" w:customStyle="1" w:styleId="Tablaconcuadrcula1">
+    <w:name w:val="Tabla con cuadrícula1"/>
+    <w:basedOn w:val="Tablanormal"/>
+    <w:next w:val="Tablaconcuadrcula"/>
+    <w:uiPriority w:val="59"/>
+    <w:rsid w:val="00DC07A2"/>
+    <w:pPr>
+      <w:spacing w:after="0" w:line="240" w:lineRule="auto"/>
+    </w:pPr>
+    <w:tblPr>
+      <w:tblBorders>
+        <w:top w:val="single" w:sz="4" w:space="0" w:color="auto"/>
+        <w:left w:val="single" w:sz="4" w:space="0" w:color="auto"/>
+        <w:bottom w:val="single" w:sz="4" w:space="0" w:color="auto"/>
+        <w:right w:val="single" w:sz="4" w:space="0" w:color="auto"/>
+        <w:insideH w:val="single" w:sz="4" w:space="0" w:color="auto"/>
+        <w:insideV w:val="single" w:sz="4" w:space="0" w:color="auto"/>
+      </w:tblBorders>
+    </w:tblPr>
+  </w:style>
 </w:styles>
 </file>
 

</xml_diff>